<commit_message>
Video Streaming over UDP using openCV (updated)
</commit_message>
<xml_diff>
--- a/Computer Networks/Advanced/Lab/Assignment_3/22CS02002_SohamChakraborty_Assignment_3.docx
+++ b/Computer Networks/Advanced/Lab/Assignment_3/22CS02002_SohamChakraborty_Assignment_3.docx
@@ -965,6 +965,194 @@
     </w:p>
     <w:p>
       <w:pPr>
+        <w:pStyle w:val="ListParagraph"/>
+        <w:numPr>
+          <w:ilvl w:val="0"/>
+          <w:numId w:val="1"/>
+        </w:numPr>
+        <w:rPr>
+          <w:sz w:val="28"/>
+          <w:szCs w:val="28"/>
+        </w:rPr>
+      </w:pPr>
+      <w:r>
+        <w:rPr>
+          <w:b/>
+          <w:bCs/>
+          <w:sz w:val="32"/>
+          <w:szCs w:val="32"/>
+        </w:rPr>
+        <w:t>Problem:</w:t>
+      </w:r>
+      <w:r>
+        <w:rPr>
+          <w:sz w:val="28"/>
+          <w:szCs w:val="28"/>
+        </w:rPr>
+        <w:t xml:space="preserve"> Lowering the -d (--delay-between-frames) to 5 makes the program/client crash after sending a certain number of frames.</w:t>
+      </w:r>
+    </w:p>
+    <w:p>
+      <w:pPr>
+        <w:pStyle w:val="ListParagraph"/>
+        <w:ind w:left="643"/>
+        <w:rPr>
+          <w:bCs/>
+          <w:iCs/>
+          <w:sz w:val="28"/>
+          <w:szCs w:val="28"/>
+        </w:rPr>
+      </w:pPr>
+      <w:r>
+        <w:rPr>
+          <w:b/>
+          <w:bCs/>
+          <w:sz w:val="32"/>
+          <w:szCs w:val="32"/>
+        </w:rPr>
+        <w:t>Solution:</w:t>
+      </w:r>
+      <w:r>
+        <w:rPr>
+          <w:sz w:val="28"/>
+          <w:szCs w:val="28"/>
+        </w:rPr>
+        <w:t xml:space="preserve"> This is because the server is sending frames so fast that client can’t keep up with decoding and displaying the frame and then moving on to the next one. In my code I have </w:t>
+      </w:r>
+      <w:r>
+        <w:rPr>
+          <w:b/>
+          <w:i/>
+          <w:sz w:val="28"/>
+          <w:szCs w:val="28"/>
+        </w:rPr>
+        <w:t>waitKey(5)</w:t>
+      </w:r>
+      <w:r>
+        <w:rPr>
+          <w:b/>
+          <w:i/>
+          <w:sz w:val="28"/>
+          <w:szCs w:val="28"/>
+        </w:rPr>
+        <w:t xml:space="preserve"> </w:t>
+      </w:r>
+      <w:r>
+        <w:rPr>
+          <w:bCs/>
+          <w:iCs/>
+          <w:sz w:val="28"/>
+          <w:szCs w:val="28"/>
+        </w:rPr>
+        <w:t xml:space="preserve">i.e. I want for 5ms for escape key. Delay by server has to be higher than at least this value, because otherwise frames received by client would be incomplete or </w:t>
+      </w:r>
+      <w:r>
+        <w:rPr>
+          <w:bCs/>
+          <w:iCs/>
+          <w:sz w:val="28"/>
+          <w:szCs w:val="28"/>
+        </w:rPr>
+        <w:t>multiple in between frames are skipped, resulting in segmentation fault.</w:t>
+      </w:r>
+      <w:r>
+        <w:rPr>
+          <w:bCs/>
+          <w:iCs/>
+          <w:sz w:val="28"/>
+          <w:szCs w:val="28"/>
+        </w:rPr>
+        <w:br/>
+        <w:t>Also, it is noticed that lowering to around 10 makes the video run very fast around 3 times faster.</w:t>
+      </w:r>
+      <w:r>
+        <w:rPr>
+          <w:bCs/>
+          <w:iCs/>
+          <w:sz w:val="28"/>
+          <w:szCs w:val="28"/>
+        </w:rPr>
+        <w:br/>
+        <w:t>Thus, I believe that –delay-between-frames effectively controls the speed of video.</w:t>
+      </w:r>
+    </w:p>
+    <w:p>
+      <w:pPr>
+        <w:pStyle w:val="ListParagraph"/>
+        <w:numPr>
+          <w:ilvl w:val="0"/>
+          <w:numId w:val="1"/>
+        </w:numPr>
+        <w:rPr>
+          <w:sz w:val="28"/>
+          <w:szCs w:val="28"/>
+        </w:rPr>
+      </w:pPr>
+      <w:r>
+        <w:rPr>
+          <w:b/>
+          <w:bCs/>
+          <w:sz w:val="32"/>
+          <w:szCs w:val="32"/>
+        </w:rPr>
+        <w:lastRenderedPageBreak/>
+        <w:t>Problem:</w:t>
+      </w:r>
+      <w:r>
+        <w:rPr>
+          <w:sz w:val="28"/>
+          <w:szCs w:val="28"/>
+        </w:rPr>
+        <w:t xml:space="preserve"> Increasing -d (--delay-between-frames) to 100 makes the program/client very laggy.</w:t>
+      </w:r>
+    </w:p>
+    <w:p>
+      <w:pPr>
+        <w:ind w:left="643"/>
+        <w:rPr>
+          <w:sz w:val="28"/>
+          <w:szCs w:val="28"/>
+        </w:rPr>
+      </w:pPr>
+      <w:r>
+        <w:rPr>
+          <w:b/>
+          <w:bCs/>
+          <w:sz w:val="32"/>
+          <w:szCs w:val="32"/>
+        </w:rPr>
+        <w:t>Solution:</w:t>
+      </w:r>
+      <w:r>
+        <w:rPr>
+          <w:sz w:val="28"/>
+          <w:szCs w:val="28"/>
+        </w:rPr>
+        <w:t xml:space="preserve"> This is because the server is sending frames extremely slowly and there is no way to improve this from the client end. Video runs 3 times slower as opposed to previous case.</w:t>
+      </w:r>
+      <w:r>
+        <w:rPr>
+          <w:sz w:val="28"/>
+          <w:szCs w:val="28"/>
+        </w:rPr>
+        <w:br/>
+        <w:t>However, there is a lower chance of multiple packets being sent one on top of another, so reliability in this case is very high (at the cost of performance).</w:t>
+      </w:r>
+    </w:p>
+    <w:p>
+      <w:pPr>
+        <w:ind w:left="643"/>
+        <w:rPr>
+          <w:b/>
+          <w:bCs/>
+          <w:sz w:val="32"/>
+          <w:szCs w:val="32"/>
+        </w:rPr>
+      </w:pPr>
+    </w:p>
+    <w:p>
+      <w:pPr>
+        <w:ind w:left="643"/>
         <w:rPr>
           <w:b/>
           <w:bCs/>
@@ -1159,7 +1347,6 @@
           <w:sz w:val="32"/>
           <w:szCs w:val="32"/>
         </w:rPr>
-        <w:lastRenderedPageBreak/>
         <w:t>Problem</w:t>
       </w:r>
       <w:r>
@@ -1376,7 +1563,15 @@
           <w:sz w:val="28"/>
           <w:szCs w:val="28"/>
         </w:rPr>
-        <w:t xml:space="preserve">I am assuming that whenever Client sends request for a certain wrong frameIndex if server receives the request while it is in the middle of sending some other frame then that request is ignored. </w:t>
+        <w:t xml:space="preserve">I am assuming that whenever Client sends request for a certain wrong </w:t>
+      </w:r>
+      <w:r>
+        <w:rPr>
+          <w:sz w:val="28"/>
+          <w:szCs w:val="28"/>
+        </w:rPr>
+        <w:lastRenderedPageBreak/>
+        <w:t xml:space="preserve">frameIndex if server receives the request while it is in the middle of sending some other frame then that request is ignored. </w:t>
       </w:r>
       <w:r>
         <w:rPr>
@@ -1470,69 +1665,28 @@
           <w:numId w:val="2"/>
         </w:numPr>
         <w:rPr>
-          <w:i/>
-          <w:iCs/>
-        </w:rPr>
-      </w:pPr>
-      <w:r>
-        <w:rPr>
-          <w:b/>
-          <w:bCs/>
-          <w:sz w:val="32"/>
-          <w:szCs w:val="32"/>
-        </w:rPr>
-        <w:t xml:space="preserve">Problem: </w:t>
-      </w:r>
-      <w:r>
-        <w:rPr>
-          <w:sz w:val="28"/>
-          <w:szCs w:val="28"/>
-        </w:rPr>
-        <w:t xml:space="preserve">Even with the above fix, if using flag -c then around frame 250, the video becomes very laggy to practically paused. </w:t>
-      </w:r>
-      <w:r>
-        <w:rPr>
-          <w:sz w:val="28"/>
-          <w:szCs w:val="28"/>
-        </w:rPr>
-        <w:br/>
-      </w:r>
-      <w:r>
-        <w:rPr>
-          <w:b/>
-          <w:bCs/>
-          <w:sz w:val="28"/>
-          <w:szCs w:val="28"/>
-        </w:rPr>
-        <w:t>Solution</w:t>
-      </w:r>
-      <w:r>
-        <w:rPr>
-          <w:b/>
-          <w:bCs/>
-          <w:sz w:val="32"/>
-          <w:szCs w:val="32"/>
-        </w:rPr>
-        <w:t>:</w:t>
-      </w:r>
-      <w:r>
-        <w:t xml:space="preserve"> </w:t>
-      </w:r>
-      <w:r>
-        <w:rPr>
-          <w:i/>
-          <w:iCs/>
-          <w:sz w:val="28"/>
-          <w:szCs w:val="28"/>
-        </w:rPr>
-        <w:t xml:space="preserve">Once again, this is just a hypothesis since </w:t>
-      </w:r>
-      <w:r>
-        <w:rPr>
-          <w:i/>
-          <w:iCs/>
-        </w:rPr>
-        <w:t>I don’t have server code.</w:t>
+          <w:sz w:val="28"/>
+          <w:szCs w:val="28"/>
+        </w:rPr>
+      </w:pPr>
+      <w:r>
+        <w:rPr>
+          <w:b/>
+          <w:bCs/>
+          <w:sz w:val="32"/>
+          <w:szCs w:val="32"/>
+        </w:rPr>
+        <w:t>Problem</w:t>
+      </w:r>
+      <w:r>
+        <w:t xml:space="preserve">: </w:t>
+      </w:r>
+      <w:r>
+        <w:rPr>
+          <w:sz w:val="28"/>
+          <w:szCs w:val="28"/>
+        </w:rPr>
+        <w:t>Server sending frame0 after frame255.</w:t>
       </w:r>
     </w:p>
     <w:p>
@@ -1546,44 +1700,75 @@
       </w:pPr>
       <w:r>
         <w:rPr>
-          <w:sz w:val="28"/>
-          <w:szCs w:val="28"/>
-        </w:rPr>
-        <w:t>Consider the case, where the frame size to be sent by server i</w:t>
-      </w:r>
-      <w:r>
-        <w:rPr>
-          <w:sz w:val="28"/>
-          <w:szCs w:val="28"/>
-        </w:rPr>
-        <w:t xml:space="preserve">s very large, and client already previously sent many requests to server for a particular frame. If the server processes all frame requests one by one and keeps sending the same large frame multiple times, it takes a lot of time. And after all that processing the frame sent by server becomes useless. In the meantime while waiting the required frame client sends multiple requests for that frame and when it finally gets the desired frame, multiple previous requests to server for that frame is still pending. This results in a positive feedback loop and latency keeps increasing from then </w:t>
-      </w:r>
-      <w:r>
-        <w:rPr>
-          <w:sz w:val="28"/>
-          <w:szCs w:val="28"/>
-        </w:rPr>
-        <w:lastRenderedPageBreak/>
-        <w:t>onwards.</w:t>
-      </w:r>
-      <w:r>
-        <w:rPr>
+          <w:b/>
+          <w:bCs/>
+          <w:sz w:val="32"/>
+          <w:szCs w:val="32"/>
+        </w:rPr>
+        <w:t>Solution:</w:t>
+      </w:r>
+      <w:r>
+        <w:rPr>
+          <w:sz w:val="28"/>
+          <w:szCs w:val="28"/>
+        </w:rPr>
+        <w:t xml:space="preserve"> </w:t>
+      </w:r>
+      <w:r>
+        <w:rPr>
+          <w:sz w:val="28"/>
+          <w:szCs w:val="28"/>
+        </w:rPr>
+        <w:t xml:space="preserve"> </w:t>
+      </w:r>
+      <w:r>
+        <w:rPr>
+          <w:i/>
+          <w:iCs/>
+          <w:sz w:val="28"/>
+          <w:szCs w:val="28"/>
+        </w:rPr>
+        <w:t>This is just a hypothesis since I don’t have server code.</w:t>
+      </w:r>
+      <w:r>
+        <w:rPr>
+          <w:i/>
+          <w:iCs/>
           <w:sz w:val="28"/>
           <w:szCs w:val="28"/>
         </w:rPr>
         <w:br/>
-        <w:t>One solution to this would be from the server side. Instead of processing all pending requests, only send frame from the last request. Also, whenever a frame request comes while another frame is in mid-transmission stop that transmission and start sending the newly requested frame. However, these are server side modifications and I can’t resolve it without the source code. This should in theory remove most if not all of buffer observed.</w:t>
-      </w:r>
-    </w:p>
-    <w:p>
-      <w:pPr>
-        <w:pStyle w:val="ListParagraph"/>
-        <w:ind w:left="643"/>
-        <w:rPr>
-          <w:sz w:val="28"/>
-          <w:szCs w:val="28"/>
-        </w:rPr>
-      </w:pPr>
+      </w:r>
+      <w:r>
+        <w:rPr>
+          <w:sz w:val="28"/>
+          <w:szCs w:val="28"/>
+        </w:rPr>
+        <w:t xml:space="preserve">I am assuming </w:t>
+      </w:r>
+      <w:r>
+        <w:rPr>
+          <w:sz w:val="28"/>
+          <w:szCs w:val="28"/>
+        </w:rPr>
+        <w:t xml:space="preserve">that even though in Assignment it is given that frameIndex to be of type uint32_t, in the server implementation for receiving requests it is using uint8_t, because after frame255 it takes 2B space instead of 1B for the payload and server resets wraps it around to 0 again. Without knowing further information on how server is receiving and decoding client requests and also proper validity and correctness of server code it is </w:t>
+      </w:r>
+      <w:r>
+        <w:rPr>
+          <w:b/>
+          <w:i/>
+          <w:sz w:val="28"/>
+          <w:szCs w:val="28"/>
+        </w:rPr>
+        <w:t>(in my opinion)</w:t>
+      </w:r>
+      <w:r>
+        <w:rPr>
+          <w:sz w:val="28"/>
+          <w:szCs w:val="28"/>
+        </w:rPr>
+        <w:t xml:space="preserve"> not possible to further explore this issue.</w:t>
+      </w:r>
     </w:p>
     <w:p>
       <w:pPr>
@@ -1603,8 +1788,8 @@
           <w:numId w:val="2"/>
         </w:numPr>
         <w:rPr>
-          <w:sz w:val="28"/>
-          <w:szCs w:val="28"/>
+          <w:i/>
+          <w:iCs/>
         </w:rPr>
       </w:pPr>
       <w:r>
@@ -1621,14 +1806,139 @@
           <w:sz w:val="28"/>
           <w:szCs w:val="28"/>
         </w:rPr>
-        <w:t>Setting --packet-drop-prob 0.9 or some other high value also introduces a very high buffer.</w:t>
-      </w:r>
-      <w:r>
-        <w:rPr>
-          <w:sz w:val="28"/>
-          <w:szCs w:val="28"/>
-        </w:rPr>
+        <w:t xml:space="preserve">Even with the above fix, if using flag -c then around frame 250, the video becomes very laggy to practically paused. </w:t>
+      </w:r>
+      <w:r>
+        <w:rPr>
+          <w:sz w:val="28"/>
+          <w:szCs w:val="28"/>
+        </w:rPr>
+        <w:br/>
+      </w:r>
+      <w:r>
+        <w:rPr>
+          <w:b/>
+          <w:bCs/>
+          <w:sz w:val="28"/>
+          <w:szCs w:val="28"/>
+        </w:rPr>
+        <w:t>Solution</w:t>
+      </w:r>
+      <w:r>
+        <w:rPr>
+          <w:b/>
+          <w:bCs/>
+          <w:sz w:val="32"/>
+          <w:szCs w:val="32"/>
+        </w:rPr>
+        <w:t>:</w:t>
+      </w:r>
+      <w:r>
         <w:t xml:space="preserve"> </w:t>
+      </w:r>
+      <w:r>
+        <w:rPr>
+          <w:i/>
+          <w:iCs/>
+          <w:sz w:val="28"/>
+          <w:szCs w:val="28"/>
+        </w:rPr>
+        <w:t xml:space="preserve">Once again, this is just a hypothesis since </w:t>
+      </w:r>
+      <w:r>
+        <w:rPr>
+          <w:i/>
+          <w:iCs/>
+        </w:rPr>
+        <w:t>I don’t have server code.</w:t>
+      </w:r>
+    </w:p>
+    <w:p>
+      <w:pPr>
+        <w:pStyle w:val="ListParagraph"/>
+        <w:ind w:left="643"/>
+        <w:rPr>
+          <w:sz w:val="28"/>
+          <w:szCs w:val="28"/>
+        </w:rPr>
+      </w:pPr>
+      <w:r>
+        <w:rPr>
+          <w:sz w:val="28"/>
+          <w:szCs w:val="28"/>
+        </w:rPr>
+        <w:t>Consider the case, where the frame size to be sent by server i</w:t>
+      </w:r>
+      <w:r>
+        <w:rPr>
+          <w:sz w:val="28"/>
+          <w:szCs w:val="28"/>
+        </w:rPr>
+        <w:t>s very large, and client already previously sent many requests to server for a particular frame. If the server processes all frame requests one by one and keeps sending the same large frame multiple times, it takes a lot of time. And after all that processing the frame sent by server becomes useless. In the meantime while waiting the required frame client sends multiple requests for that frame and when it finally gets the desired frame, multiple previous requests to server for that frame is still pending. This results in a positive feedback loop and latency keeps increasing from then onwards.</w:t>
+      </w:r>
+      <w:r>
+        <w:rPr>
+          <w:sz w:val="28"/>
+          <w:szCs w:val="28"/>
+        </w:rPr>
+        <w:br/>
+      </w:r>
+      <w:r>
+        <w:rPr>
+          <w:sz w:val="28"/>
+          <w:szCs w:val="28"/>
+        </w:rPr>
+        <w:lastRenderedPageBreak/>
+        <w:t>One solution to this would be from the server side. Instead of processing all pending requests, only send frame from the last request. Also, whenever a frame request comes while another frame is in mid-transmission stop that transmission and start sending the newly requested frame. However, these are server side modifications and I can’t resolve it without the source code. This should in theory remove most if not all of buffer observed.</w:t>
+      </w:r>
+    </w:p>
+    <w:p>
+      <w:pPr>
+        <w:pStyle w:val="ListParagraph"/>
+        <w:ind w:left="643"/>
+        <w:rPr>
+          <w:sz w:val="28"/>
+          <w:szCs w:val="28"/>
+        </w:rPr>
+      </w:pPr>
+    </w:p>
+    <w:p>
+      <w:pPr>
+        <w:pStyle w:val="ListParagraph"/>
+        <w:ind w:left="643"/>
+        <w:rPr>
+          <w:sz w:val="28"/>
+          <w:szCs w:val="28"/>
+        </w:rPr>
+      </w:pPr>
+    </w:p>
+    <w:p>
+      <w:pPr>
+        <w:pStyle w:val="ListParagraph"/>
+        <w:numPr>
+          <w:ilvl w:val="0"/>
+          <w:numId w:val="2"/>
+        </w:numPr>
+        <w:rPr>
+          <w:sz w:val="28"/>
+          <w:szCs w:val="28"/>
+        </w:rPr>
+      </w:pPr>
+      <w:r>
+        <w:rPr>
+          <w:b/>
+          <w:bCs/>
+          <w:sz w:val="32"/>
+          <w:szCs w:val="32"/>
+        </w:rPr>
+        <w:t xml:space="preserve">Problem: </w:t>
+      </w:r>
+      <w:r>
+        <w:rPr>
+          <w:sz w:val="28"/>
+          <w:szCs w:val="28"/>
+        </w:rPr>
+        <w:t xml:space="preserve">Setting --packet-drop-prob 0.9 or some other high value also introduces a very high buffer. </w:t>
       </w:r>
       <w:r>
         <w:rPr>
@@ -2325,6 +2635,123 @@
       </w:pPr>
     </w:lvl>
   </w:abstractNum>
+  <w:abstractNum w:abstractNumId="3" w15:restartNumberingAfterBreak="0">
+    <w:nsid w:val="6F821C10"/>
+    <w:multiLevelType w:val="hybridMultilevel"/>
+    <w:tmpl w:val="F04E9BB0"/>
+    <w:lvl w:ilvl="0" w:tplc="FFFFFFFF">
+      <w:start w:val="1"/>
+      <w:numFmt w:val="decimal"/>
+      <w:lvlText w:val="%1."/>
+      <w:lvlJc w:val="left"/>
+      <w:pPr>
+        <w:ind w:left="643" w:hanging="360"/>
+      </w:pPr>
+      <w:rPr>
+        <w:rFonts w:asciiTheme="minorHAnsi" w:eastAsiaTheme="minorHAnsi" w:hAnsiTheme="minorHAnsi" w:cstheme="minorBidi"/>
+        <w:b/>
+        <w:bCs/>
+        <w:sz w:val="28"/>
+        <w:szCs w:val="28"/>
+      </w:rPr>
+    </w:lvl>
+    <w:lvl w:ilvl="1" w:tplc="FFFFFFFF">
+      <w:start w:val="1"/>
+      <w:numFmt w:val="bullet"/>
+      <w:lvlText w:val="o"/>
+      <w:lvlJc w:val="left"/>
+      <w:pPr>
+        <w:ind w:left="1363" w:hanging="360"/>
+      </w:pPr>
+      <w:rPr>
+        <w:rFonts w:ascii="Courier New" w:hAnsi="Courier New" w:cs="Courier New" w:hint="default"/>
+      </w:rPr>
+    </w:lvl>
+    <w:lvl w:ilvl="2" w:tplc="FFFFFFFF" w:tentative="1">
+      <w:start w:val="1"/>
+      <w:numFmt w:val="bullet"/>
+      <w:lvlText w:val=""/>
+      <w:lvlJc w:val="left"/>
+      <w:pPr>
+        <w:ind w:left="2083" w:hanging="360"/>
+      </w:pPr>
+      <w:rPr>
+        <w:rFonts w:ascii="Wingdings" w:hAnsi="Wingdings" w:hint="default"/>
+      </w:rPr>
+    </w:lvl>
+    <w:lvl w:ilvl="3" w:tplc="FFFFFFFF" w:tentative="1">
+      <w:start w:val="1"/>
+      <w:numFmt w:val="bullet"/>
+      <w:lvlText w:val=""/>
+      <w:lvlJc w:val="left"/>
+      <w:pPr>
+        <w:ind w:left="2803" w:hanging="360"/>
+      </w:pPr>
+      <w:rPr>
+        <w:rFonts w:ascii="Symbol" w:hAnsi="Symbol" w:hint="default"/>
+      </w:rPr>
+    </w:lvl>
+    <w:lvl w:ilvl="4" w:tplc="FFFFFFFF" w:tentative="1">
+      <w:start w:val="1"/>
+      <w:numFmt w:val="bullet"/>
+      <w:lvlText w:val="o"/>
+      <w:lvlJc w:val="left"/>
+      <w:pPr>
+        <w:ind w:left="3523" w:hanging="360"/>
+      </w:pPr>
+      <w:rPr>
+        <w:rFonts w:ascii="Courier New" w:hAnsi="Courier New" w:cs="Courier New" w:hint="default"/>
+      </w:rPr>
+    </w:lvl>
+    <w:lvl w:ilvl="5" w:tplc="FFFFFFFF" w:tentative="1">
+      <w:start w:val="1"/>
+      <w:numFmt w:val="bullet"/>
+      <w:lvlText w:val=""/>
+      <w:lvlJc w:val="left"/>
+      <w:pPr>
+        <w:ind w:left="4243" w:hanging="360"/>
+      </w:pPr>
+      <w:rPr>
+        <w:rFonts w:ascii="Wingdings" w:hAnsi="Wingdings" w:hint="default"/>
+      </w:rPr>
+    </w:lvl>
+    <w:lvl w:ilvl="6" w:tplc="FFFFFFFF" w:tentative="1">
+      <w:start w:val="1"/>
+      <w:numFmt w:val="bullet"/>
+      <w:lvlText w:val=""/>
+      <w:lvlJc w:val="left"/>
+      <w:pPr>
+        <w:ind w:left="4963" w:hanging="360"/>
+      </w:pPr>
+      <w:rPr>
+        <w:rFonts w:ascii="Symbol" w:hAnsi="Symbol" w:hint="default"/>
+      </w:rPr>
+    </w:lvl>
+    <w:lvl w:ilvl="7" w:tplc="FFFFFFFF" w:tentative="1">
+      <w:start w:val="1"/>
+      <w:numFmt w:val="bullet"/>
+      <w:lvlText w:val="o"/>
+      <w:lvlJc w:val="left"/>
+      <w:pPr>
+        <w:ind w:left="5683" w:hanging="360"/>
+      </w:pPr>
+      <w:rPr>
+        <w:rFonts w:ascii="Courier New" w:hAnsi="Courier New" w:cs="Courier New" w:hint="default"/>
+      </w:rPr>
+    </w:lvl>
+    <w:lvl w:ilvl="8" w:tplc="FFFFFFFF" w:tentative="1">
+      <w:start w:val="1"/>
+      <w:numFmt w:val="bullet"/>
+      <w:lvlText w:val=""/>
+      <w:lvlJc w:val="left"/>
+      <w:pPr>
+        <w:ind w:left="6403" w:hanging="360"/>
+      </w:pPr>
+      <w:rPr>
+        <w:rFonts w:ascii="Wingdings" w:hAnsi="Wingdings" w:hint="default"/>
+      </w:rPr>
+    </w:lvl>
+  </w:abstractNum>
   <w:num w:numId="1" w16cid:durableId="1343051437">
     <w:abstractNumId w:val="0"/>
   </w:num>
@@ -2333,6 +2760,9 @@
   </w:num>
   <w:num w:numId="3" w16cid:durableId="2121216051">
     <w:abstractNumId w:val="1"/>
+  </w:num>
+  <w:num w:numId="4" w16cid:durableId="1493255399">
+    <w:abstractNumId w:val="3"/>
   </w:num>
 </w:numbering>
 </file>
@@ -2737,7 +3167,7 @@
   <w:style w:type="paragraph" w:default="1" w:styleId="Normal">
     <w:name w:val="Normal"/>
     <w:qFormat/>
-    <w:rsid w:val="000B2300"/>
+    <w:rsid w:val="00502087"/>
   </w:style>
   <w:style w:type="paragraph" w:styleId="Heading1">
     <w:name w:val="heading 1"/>

</xml_diff>

<commit_message>
Online multiplayer Game server over UDP
</commit_message>
<xml_diff>
--- a/Computer Networks/Advanced/Lab/Assignment_3/22CS02002_SohamChakraborty_Assignment_3.docx
+++ b/Computer Networks/Advanced/Lab/Assignment_3/22CS02002_SohamChakraborty_Assignment_3.docx
@@ -173,12 +173,37 @@
       <w:r>
         <w:t xml:space="preserve"> </w:t>
       </w:r>
-      <w:r>
-        <w:rPr>
-          <w:sz w:val="28"/>
-          <w:szCs w:val="28"/>
-        </w:rPr>
-        <w:t>sudo apt install libavdevice-dev</w:t>
+      <w:proofErr w:type="spellStart"/>
+      <w:r>
+        <w:rPr>
+          <w:sz w:val="28"/>
+          <w:szCs w:val="28"/>
+        </w:rPr>
+        <w:t>sudo</w:t>
+      </w:r>
+      <w:proofErr w:type="spellEnd"/>
+      <w:r>
+        <w:rPr>
+          <w:sz w:val="28"/>
+          <w:szCs w:val="28"/>
+        </w:rPr>
+        <w:t xml:space="preserve"> apt install </w:t>
+      </w:r>
+      <w:proofErr w:type="spellStart"/>
+      <w:r>
+        <w:rPr>
+          <w:sz w:val="28"/>
+          <w:szCs w:val="28"/>
+        </w:rPr>
+        <w:t>libavdevice</w:t>
+      </w:r>
+      <w:proofErr w:type="spellEnd"/>
+      <w:r>
+        <w:rPr>
+          <w:sz w:val="28"/>
+          <w:szCs w:val="28"/>
+        </w:rPr>
+        <w:t>-dev</w:t>
       </w:r>
       <w:r>
         <w:rPr>
@@ -249,12 +274,21 @@
         </w:rPr>
         <w:t xml:space="preserve"> </w:t>
       </w:r>
-      <w:r>
-        <w:rPr>
-          <w:sz w:val="28"/>
-          <w:szCs w:val="28"/>
-        </w:rPr>
-        <w:t>sudo apt install libgtk2.0-0</w:t>
+      <w:proofErr w:type="spellStart"/>
+      <w:r>
+        <w:rPr>
+          <w:sz w:val="28"/>
+          <w:szCs w:val="28"/>
+        </w:rPr>
+        <w:t>sudo</w:t>
+      </w:r>
+      <w:proofErr w:type="spellEnd"/>
+      <w:r>
+        <w:rPr>
+          <w:sz w:val="28"/>
+          <w:szCs w:val="28"/>
+        </w:rPr>
+        <w:t xml:space="preserve"> apt install libgtk2.0-0</w:t>
       </w:r>
     </w:p>
     <w:p>
@@ -303,8 +337,10 @@
         <w:pStyle w:val="ListParagraph"/>
         <w:ind w:left="643"/>
         <w:rPr>
-          <w:sz w:val="28"/>
-          <w:szCs w:val="28"/>
+          <w:i/>
+          <w:iCs/>
+          <w:sz w:val="32"/>
+          <w:szCs w:val="32"/>
         </w:rPr>
       </w:pPr>
       <w:r>
@@ -369,11 +405,37 @@
           <w:numId w:val="1"/>
         </w:numPr>
         <w:rPr>
+          <w:sz w:val="28"/>
+          <w:szCs w:val="28"/>
+        </w:rPr>
+      </w:pPr>
+      <w:r>
+        <w:rPr>
           <w:b/>
           <w:bCs/>
           <w:sz w:val="32"/>
           <w:szCs w:val="32"/>
         </w:rPr>
+        <w:t>Problem:</w:t>
+      </w:r>
+      <w:r>
+        <w:rPr>
+          <w:sz w:val="28"/>
+          <w:szCs w:val="28"/>
+        </w:rPr>
+        <w:t xml:space="preserve"> Lowering the -d (--delay-between-frames) to 5 makes the program/client crash after sending a certain number of frames.</w:t>
+      </w:r>
+    </w:p>
+    <w:p>
+      <w:pPr>
+        <w:pStyle w:val="ListParagraph"/>
+        <w:ind w:left="643"/>
+        <w:rPr>
+          <w:bCs/>
+          <w:iCs/>
+          <w:sz w:val="28"/>
+          <w:szCs w:val="28"/>
+        </w:rPr>
       </w:pPr>
       <w:r>
         <w:rPr>
@@ -382,581 +444,98 @@
           <w:sz w:val="32"/>
           <w:szCs w:val="32"/>
         </w:rPr>
-        <w:t xml:space="preserve">Problem: </w:t>
-      </w:r>
-      <w:r>
-        <w:rPr>
-          <w:sz w:val="28"/>
-          <w:szCs w:val="28"/>
-        </w:rPr>
-        <w:t>Empty/Incorrect sections in received Video Metadata.</w:t>
-      </w:r>
-    </w:p>
-    <w:p>
-      <w:pPr>
-        <w:pStyle w:val="ListParagraph"/>
-        <w:ind w:left="643"/>
-        <w:rPr>
+        <w:t>Solution:</w:t>
+      </w:r>
+      <w:r>
+        <w:rPr>
+          <w:sz w:val="28"/>
+          <w:szCs w:val="28"/>
+        </w:rPr>
+        <w:t xml:space="preserve"> This is because the server is sending frames so fast that client can’t keep up with decoding and displaying the frame and then moving on to the next one. In my code I have </w:t>
+      </w:r>
+      <w:proofErr w:type="spellStart"/>
+      <w:proofErr w:type="gramStart"/>
+      <w:r>
+        <w:rPr>
+          <w:b/>
           <w:i/>
+          <w:sz w:val="28"/>
+          <w:szCs w:val="28"/>
+        </w:rPr>
+        <w:t>waitKey</w:t>
+      </w:r>
+      <w:proofErr w:type="spellEnd"/>
+      <w:r>
+        <w:rPr>
+          <w:b/>
+          <w:i/>
+          <w:sz w:val="28"/>
+          <w:szCs w:val="28"/>
+        </w:rPr>
+        <w:t>(</w:t>
+      </w:r>
+      <w:proofErr w:type="gramEnd"/>
+      <w:r>
+        <w:rPr>
+          <w:b/>
+          <w:i/>
+          <w:sz w:val="28"/>
+          <w:szCs w:val="28"/>
+        </w:rPr>
+        <w:t>5)</w:t>
+      </w:r>
+      <w:r>
+        <w:rPr>
+          <w:b/>
+          <w:i/>
+          <w:sz w:val="28"/>
+          <w:szCs w:val="28"/>
+        </w:rPr>
+        <w:t xml:space="preserve"> </w:t>
+      </w:r>
+      <w:r>
+        <w:rPr>
+          <w:bCs/>
           <w:iCs/>
           <w:sz w:val="28"/>
           <w:szCs w:val="28"/>
         </w:rPr>
-      </w:pPr>
-      <w:r>
-        <w:rPr>
-          <w:b/>
-          <w:bCs/>
-          <w:sz w:val="32"/>
-          <w:szCs w:val="32"/>
-        </w:rPr>
-        <w:t>Solution:</w:t>
-      </w:r>
-      <w:r>
-        <w:t xml:space="preserve"> </w:t>
-      </w:r>
-      <w:r>
-        <w:rPr>
-          <w:sz w:val="28"/>
-          <w:szCs w:val="28"/>
-        </w:rPr>
-        <w:t xml:space="preserve">I firmly believe that either </w:t>
-      </w:r>
-      <w:r>
-        <w:rPr>
-          <w:b/>
-          <w:bCs/>
-          <w:sz w:val="28"/>
-          <w:szCs w:val="28"/>
-        </w:rPr>
-        <w:t xml:space="preserve">Page 8 of Assignment 3.1 </w:t>
-      </w:r>
-      <w:r>
-        <w:rPr>
-          <w:sz w:val="28"/>
-          <w:szCs w:val="28"/>
-        </w:rPr>
-        <w:t>in which distribution of memory addresses (variable sizes) for the sections -</w:t>
-      </w:r>
-      <w:r>
-        <w:rPr>
-          <w:b/>
-          <w:bCs/>
-          <w:i/>
+        <w:t xml:space="preserve">i.e. I want for 5ms for escape key. Delay by server has to be higher than at least this value, because otherwise frames received by client would be incomplete or </w:t>
+      </w:r>
+      <w:r>
+        <w:rPr>
+          <w:bCs/>
           <w:iCs/>
           <w:sz w:val="28"/>
           <w:szCs w:val="28"/>
         </w:rPr>
-        <w:t>packetType</w:t>
-      </w:r>
-      <w:r>
-        <w:rPr>
-          <w:i/>
+        <w:lastRenderedPageBreak/>
+        <w:t>multiple in between frames are skipped, resulting in segmentation fault.</w:t>
+      </w:r>
+      <w:r>
+        <w:rPr>
+          <w:bCs/>
           <w:iCs/>
           <w:sz w:val="28"/>
           <w:szCs w:val="28"/>
         </w:rPr>
-        <w:t>(1)</w:t>
-      </w:r>
-      <w:r>
-        <w:rPr>
-          <w:b/>
-          <w:bCs/>
-          <w:i/>
+        <w:br/>
+        <w:t>Also, it is noticed that lowering to around 10 makes the video run very fast around 3 times faster.</w:t>
+      </w:r>
+      <w:r>
+        <w:rPr>
+          <w:bCs/>
           <w:iCs/>
           <w:sz w:val="28"/>
           <w:szCs w:val="28"/>
         </w:rPr>
-        <w:t>|name</w:t>
-      </w:r>
-      <w:r>
-        <w:rPr>
-          <w:i/>
+        <w:br/>
+        <w:t>Thus, I believe that –delay-between-frames effectively controls the speed of video.</w:t>
+      </w:r>
+      <w:r>
+        <w:rPr>
+          <w:bCs/>
           <w:iCs/>
-          <w:sz w:val="28"/>
-          <w:szCs w:val="28"/>
-        </w:rPr>
-        <w:t>(1024)</w:t>
-      </w:r>
-      <w:r>
-        <w:rPr>
-          <w:b/>
-          <w:bCs/>
-          <w:i/>
-          <w:iCs/>
-          <w:sz w:val="28"/>
-          <w:szCs w:val="28"/>
-        </w:rPr>
-        <w:t>|fps</w:t>
-      </w:r>
-      <w:r>
-        <w:rPr>
-          <w:i/>
-          <w:iCs/>
-          <w:sz w:val="28"/>
-          <w:szCs w:val="28"/>
-        </w:rPr>
-        <w:t>(1)</w:t>
-      </w:r>
-      <w:r>
-        <w:rPr>
-          <w:b/>
-          <w:bCs/>
-          <w:i/>
-          <w:iCs/>
-          <w:sz w:val="28"/>
-          <w:szCs w:val="28"/>
-        </w:rPr>
-        <w:t>|height</w:t>
-      </w:r>
-      <w:r>
-        <w:rPr>
-          <w:i/>
-          <w:iCs/>
-          <w:sz w:val="28"/>
-          <w:szCs w:val="28"/>
-        </w:rPr>
-        <w:t>(1)</w:t>
-      </w:r>
-      <w:r>
-        <w:rPr>
-          <w:b/>
-          <w:bCs/>
-          <w:i/>
-          <w:iCs/>
-          <w:sz w:val="28"/>
-          <w:szCs w:val="28"/>
-        </w:rPr>
-        <w:t>|width</w:t>
-      </w:r>
-      <w:r>
-        <w:rPr>
-          <w:i/>
-          <w:iCs/>
-          <w:sz w:val="28"/>
-          <w:szCs w:val="28"/>
-        </w:rPr>
-        <w:t>(1)</w:t>
-      </w:r>
-      <w:r>
-        <w:rPr>
-          <w:b/>
-          <w:bCs/>
-          <w:i/>
-          <w:iCs/>
-          <w:sz w:val="28"/>
-          <w:szCs w:val="28"/>
-        </w:rPr>
-        <w:t>|frameCount</w:t>
-      </w:r>
-      <w:r>
-        <w:rPr>
-          <w:i/>
-          <w:iCs/>
-          <w:sz w:val="28"/>
-          <w:szCs w:val="28"/>
-        </w:rPr>
-        <w:t>(1)</w:t>
-      </w:r>
-    </w:p>
-    <w:p>
-      <w:pPr>
-        <w:pStyle w:val="ListParagraph"/>
-        <w:ind w:left="643"/>
-        <w:rPr>
-          <w:sz w:val="28"/>
-          <w:szCs w:val="28"/>
-        </w:rPr>
-      </w:pPr>
-      <w:r>
-        <w:rPr>
-          <w:sz w:val="28"/>
-          <w:szCs w:val="28"/>
-        </w:rPr>
-        <w:t xml:space="preserve">or the server executable is wrong. Because as per the pdf the total VideoMetadata length should be 1029 bytes. However, when I checked the same values after receiving from server I found it to be 1036 bytes. That means either one of them is wrong (mismatch). In my opinion the </w:t>
-      </w:r>
-      <w:r>
-        <w:rPr>
-          <w:sz w:val="28"/>
-          <w:szCs w:val="28"/>
-        </w:rPr>
-        <w:lastRenderedPageBreak/>
-        <w:t xml:space="preserve">Assignment </w:t>
-      </w:r>
-      <w:r>
-        <w:rPr>
-          <w:sz w:val="28"/>
-          <w:szCs w:val="28"/>
-        </w:rPr>
-        <w:t>pdf had wrong memory addresses.</w:t>
-      </w:r>
-      <w:r>
-        <w:rPr>
-          <w:sz w:val="28"/>
-          <w:szCs w:val="28"/>
-        </w:rPr>
-        <w:br/>
-        <w:t xml:space="preserve">Later when I changed to - </w:t>
-      </w:r>
-      <w:r>
-        <w:rPr>
-          <w:b/>
-          <w:bCs/>
-          <w:i/>
-          <w:iCs/>
-          <w:sz w:val="28"/>
-          <w:szCs w:val="28"/>
-        </w:rPr>
-        <w:t xml:space="preserve">height </w:t>
-      </w:r>
-      <w:r>
-        <w:rPr>
-          <w:i/>
-          <w:iCs/>
-          <w:sz w:val="28"/>
-          <w:szCs w:val="28"/>
-        </w:rPr>
-        <w:t xml:space="preserve">(2) </w:t>
-      </w:r>
-      <w:r>
-        <w:rPr>
-          <w:b/>
-          <w:bCs/>
-          <w:i/>
-          <w:iCs/>
-          <w:sz w:val="28"/>
-          <w:szCs w:val="28"/>
-        </w:rPr>
-        <w:t xml:space="preserve">| width </w:t>
-      </w:r>
-      <w:r>
-        <w:rPr>
-          <w:i/>
-          <w:iCs/>
-          <w:sz w:val="28"/>
-          <w:szCs w:val="28"/>
-        </w:rPr>
-        <w:t xml:space="preserve">(2) </w:t>
-      </w:r>
-      <w:r>
-        <w:rPr>
-          <w:b/>
-          <w:bCs/>
-          <w:i/>
-          <w:iCs/>
-          <w:sz w:val="28"/>
-          <w:szCs w:val="28"/>
-        </w:rPr>
-        <w:t xml:space="preserve">| frameCount </w:t>
-      </w:r>
-      <w:r>
-        <w:rPr>
-          <w:i/>
-          <w:iCs/>
-          <w:sz w:val="28"/>
-          <w:szCs w:val="28"/>
-        </w:rPr>
-        <w:t>(4)</w:t>
-      </w:r>
-      <w:r>
-        <w:rPr>
-          <w:i/>
-          <w:iCs/>
-          <w:sz w:val="28"/>
-          <w:szCs w:val="28"/>
-        </w:rPr>
-        <w:br/>
-      </w:r>
-      <w:r>
-        <w:rPr>
-          <w:sz w:val="28"/>
-          <w:szCs w:val="28"/>
-        </w:rPr>
-        <w:t xml:space="preserve">the problem was fixed. </w:t>
-      </w:r>
-      <w:r>
-        <w:rPr>
-          <w:sz w:val="28"/>
-          <w:szCs w:val="28"/>
-        </w:rPr>
-        <w:br/>
-      </w:r>
-      <w:r>
-        <w:rPr>
-          <w:sz w:val="28"/>
-          <w:szCs w:val="28"/>
-        </w:rPr>
-        <w:t xml:space="preserve">This changes total VideoMetadata size to 1034 bytes </w:t>
-      </w:r>
-      <w:r>
-        <w:rPr>
-          <w:sz w:val="28"/>
-          <w:szCs w:val="28"/>
-        </w:rPr>
-        <w:t>with</w:t>
-      </w:r>
-      <w:r>
-        <w:rPr>
-          <w:sz w:val="28"/>
-          <w:szCs w:val="28"/>
-        </w:rPr>
-        <w:t xml:space="preserve"> still 2 missing bytes, but it worked.</w:t>
-      </w:r>
-      <w:r>
-        <w:rPr>
-          <w:sz w:val="28"/>
-          <w:szCs w:val="28"/>
-        </w:rPr>
-        <w:t xml:space="preserve"> Also, it is impossible to determine the exact types and order of each section without knowing how the server encodes it.</w:t>
-      </w:r>
-      <w:r>
-        <w:rPr>
-          <w:sz w:val="28"/>
-          <w:szCs w:val="28"/>
-        </w:rPr>
-        <w:br/>
-      </w:r>
-    </w:p>
-    <w:p>
-      <w:pPr>
-        <w:pStyle w:val="ListParagraph"/>
-        <w:ind w:left="643"/>
-        <w:rPr>
-          <w:sz w:val="28"/>
-          <w:szCs w:val="28"/>
-        </w:rPr>
-      </w:pPr>
-    </w:p>
-    <w:p>
-      <w:pPr>
-        <w:rPr>
-          <w:b/>
-          <w:bCs/>
-          <w:sz w:val="32"/>
-          <w:szCs w:val="32"/>
-        </w:rPr>
-      </w:pPr>
-      <w:r>
-        <w:rPr>
-          <w:b/>
-          <w:bCs/>
-          <w:i/>
-          <w:iCs/>
-          <w:sz w:val="32"/>
-          <w:szCs w:val="32"/>
-        </w:rPr>
-        <w:t>NOTE</w:t>
-      </w:r>
-      <w:r>
-        <w:rPr>
-          <w:b/>
-          <w:bCs/>
-          <w:i/>
-          <w:iCs/>
-          <w:sz w:val="32"/>
-          <w:szCs w:val="32"/>
-        </w:rPr>
-        <w:t xml:space="preserve"> – </w:t>
-      </w:r>
-      <w:r>
-        <w:rPr>
-          <w:i/>
-          <w:iCs/>
-          <w:sz w:val="32"/>
-          <w:szCs w:val="32"/>
-        </w:rPr>
-        <w:t xml:space="preserve">Even though server code was not given to us, still there should have been much more clarification on how and in which order the information was encoded and sent to client. </w:t>
-      </w:r>
-      <w:r>
-        <w:rPr>
-          <w:i/>
-          <w:iCs/>
-          <w:sz w:val="32"/>
-          <w:szCs w:val="32"/>
-        </w:rPr>
-        <w:t>(</w:t>
-      </w:r>
-      <w:r>
-        <w:rPr>
-          <w:b/>
-          <w:bCs/>
-          <w:i/>
-          <w:iCs/>
-          <w:sz w:val="32"/>
-          <w:szCs w:val="32"/>
-        </w:rPr>
-        <w:t>Problem 3</w:t>
-      </w:r>
-      <w:r>
-        <w:rPr>
-          <w:i/>
-          <w:iCs/>
-          <w:sz w:val="32"/>
-          <w:szCs w:val="32"/>
-        </w:rPr>
-        <w:t>)</w:t>
-      </w:r>
-      <w:r>
-        <w:rPr>
-          <w:i/>
-          <w:iCs/>
-          <w:sz w:val="32"/>
-          <w:szCs w:val="32"/>
-        </w:rPr>
-        <w:br/>
-        <w:t xml:space="preserve">Furthermore, </w:t>
-      </w:r>
-      <w:r>
-        <w:rPr>
-          <w:b/>
-          <w:bCs/>
-          <w:i/>
-          <w:iCs/>
-          <w:sz w:val="32"/>
-          <w:szCs w:val="32"/>
-        </w:rPr>
-        <w:t xml:space="preserve">Problem 4 </w:t>
-      </w:r>
-      <w:r>
-        <w:rPr>
-          <w:i/>
-          <w:iCs/>
-          <w:sz w:val="32"/>
-          <w:szCs w:val="32"/>
-        </w:rPr>
-        <w:t>also shows why proper clarification is necessary because if I had not noticed this issue</w:t>
-      </w:r>
-      <w:r>
-        <w:rPr>
-          <w:i/>
-          <w:iCs/>
-          <w:sz w:val="32"/>
-          <w:szCs w:val="32"/>
-        </w:rPr>
-        <w:t xml:space="preserve"> (with the help of ChatGPT)</w:t>
-      </w:r>
-      <w:r>
-        <w:rPr>
-          <w:i/>
-          <w:iCs/>
-          <w:sz w:val="32"/>
-          <w:szCs w:val="32"/>
-        </w:rPr>
-        <w:t>, then even with a correct</w:t>
-      </w:r>
-      <w:r>
-        <w:rPr>
-          <w:i/>
-          <w:iCs/>
-          <w:sz w:val="32"/>
-          <w:szCs w:val="32"/>
-        </w:rPr>
-        <w:t>ly</w:t>
-      </w:r>
-      <w:r>
-        <w:rPr>
-          <w:i/>
-          <w:iCs/>
-          <w:sz w:val="32"/>
-          <w:szCs w:val="32"/>
-        </w:rPr>
-        <w:t xml:space="preserve"> working code, only due to improperly written Assignment pdf and server code</w:t>
-      </w:r>
-      <w:r>
-        <w:rPr>
-          <w:i/>
-          <w:iCs/>
-          <w:sz w:val="36"/>
-          <w:szCs w:val="36"/>
-        </w:rPr>
-        <w:t xml:space="preserve">, </w:t>
-      </w:r>
-      <w:r>
-        <w:rPr>
-          <w:i/>
-          <w:iCs/>
-          <w:sz w:val="32"/>
-          <w:szCs w:val="32"/>
-        </w:rPr>
-        <w:t>my code would have never worked</w:t>
-      </w:r>
-      <w:r>
-        <w:rPr>
-          <w:i/>
-          <w:iCs/>
-          <w:sz w:val="28"/>
-          <w:szCs w:val="28"/>
-        </w:rPr>
-        <w:t>.</w:t>
-      </w:r>
-      <w:r>
-        <w:rPr>
-          <w:i/>
-          <w:iCs/>
-          <w:sz w:val="28"/>
-          <w:szCs w:val="28"/>
-        </w:rPr>
-        <w:t xml:space="preserve"> </w:t>
-      </w:r>
-      <w:r>
-        <w:rPr>
-          <w:i/>
-          <w:iCs/>
-          <w:sz w:val="28"/>
-          <w:szCs w:val="28"/>
-        </w:rPr>
-        <w:br/>
-      </w:r>
-      <w:r>
-        <w:rPr>
-          <w:i/>
-          <w:iCs/>
-          <w:sz w:val="32"/>
-          <w:szCs w:val="32"/>
-        </w:rPr>
-        <w:t xml:space="preserve">In section </w:t>
-      </w:r>
-      <w:r>
-        <w:rPr>
-          <w:b/>
-          <w:i/>
-          <w:iCs/>
-          <w:sz w:val="32"/>
-          <w:szCs w:val="32"/>
-        </w:rPr>
-        <w:t>Part-2</w:t>
-      </w:r>
-      <w:r>
-        <w:rPr>
-          <w:b/>
-          <w:i/>
-          <w:iCs/>
-          <w:sz w:val="32"/>
-          <w:szCs w:val="32"/>
-        </w:rPr>
-        <w:t xml:space="preserve"> Problem 1, 2 </w:t>
-      </w:r>
-      <w:r>
-        <w:rPr>
-          <w:bCs/>
-          <w:i/>
-          <w:iCs/>
-          <w:sz w:val="32"/>
-          <w:szCs w:val="32"/>
-        </w:rPr>
-        <w:t>similar problems are there due to lack of proper clarification in Problem Statement regarding section encoding or incorrect information provided in Assignment pdf.</w:t>
-      </w:r>
-      <w:r>
-        <w:rPr>
-          <w:i/>
-          <w:iCs/>
-          <w:sz w:val="32"/>
-          <w:szCs w:val="32"/>
-        </w:rPr>
-        <w:t xml:space="preserve"> </w:t>
-      </w:r>
-      <w:r>
-        <w:rPr>
           <w:sz w:val="28"/>
           <w:szCs w:val="28"/>
         </w:rPr>
@@ -989,120 +568,6 @@
           <w:sz w:val="28"/>
           <w:szCs w:val="28"/>
         </w:rPr>
-        <w:t xml:space="preserve"> Lowering the -d (--delay-between-frames) to 5 makes the program/client crash after sending a certain number of frames.</w:t>
-      </w:r>
-    </w:p>
-    <w:p>
-      <w:pPr>
-        <w:pStyle w:val="ListParagraph"/>
-        <w:ind w:left="643"/>
-        <w:rPr>
-          <w:bCs/>
-          <w:iCs/>
-          <w:sz w:val="28"/>
-          <w:szCs w:val="28"/>
-        </w:rPr>
-      </w:pPr>
-      <w:r>
-        <w:rPr>
-          <w:b/>
-          <w:bCs/>
-          <w:sz w:val="32"/>
-          <w:szCs w:val="32"/>
-        </w:rPr>
-        <w:t>Solution:</w:t>
-      </w:r>
-      <w:r>
-        <w:rPr>
-          <w:sz w:val="28"/>
-          <w:szCs w:val="28"/>
-        </w:rPr>
-        <w:t xml:space="preserve"> This is because the server is sending frames so fast that client can’t keep up with decoding and displaying the frame and then moving on to the next one. In my code I have </w:t>
-      </w:r>
-      <w:r>
-        <w:rPr>
-          <w:b/>
-          <w:i/>
-          <w:sz w:val="28"/>
-          <w:szCs w:val="28"/>
-        </w:rPr>
-        <w:t>waitKey(5)</w:t>
-      </w:r>
-      <w:r>
-        <w:rPr>
-          <w:b/>
-          <w:i/>
-          <w:sz w:val="28"/>
-          <w:szCs w:val="28"/>
-        </w:rPr>
-        <w:t xml:space="preserve"> </w:t>
-      </w:r>
-      <w:r>
-        <w:rPr>
-          <w:bCs/>
-          <w:iCs/>
-          <w:sz w:val="28"/>
-          <w:szCs w:val="28"/>
-        </w:rPr>
-        <w:t xml:space="preserve">i.e. I want for 5ms for escape key. Delay by server has to be higher than at least this value, because otherwise frames received by client would be incomplete or </w:t>
-      </w:r>
-      <w:r>
-        <w:rPr>
-          <w:bCs/>
-          <w:iCs/>
-          <w:sz w:val="28"/>
-          <w:szCs w:val="28"/>
-        </w:rPr>
-        <w:t>multiple in between frames are skipped, resulting in segmentation fault.</w:t>
-      </w:r>
-      <w:r>
-        <w:rPr>
-          <w:bCs/>
-          <w:iCs/>
-          <w:sz w:val="28"/>
-          <w:szCs w:val="28"/>
-        </w:rPr>
-        <w:br/>
-        <w:t>Also, it is noticed that lowering to around 10 makes the video run very fast around 3 times faster.</w:t>
-      </w:r>
-      <w:r>
-        <w:rPr>
-          <w:bCs/>
-          <w:iCs/>
-          <w:sz w:val="28"/>
-          <w:szCs w:val="28"/>
-        </w:rPr>
-        <w:br/>
-        <w:t>Thus, I believe that –delay-between-frames effectively controls the speed of video.</w:t>
-      </w:r>
-    </w:p>
-    <w:p>
-      <w:pPr>
-        <w:pStyle w:val="ListParagraph"/>
-        <w:numPr>
-          <w:ilvl w:val="0"/>
-          <w:numId w:val="1"/>
-        </w:numPr>
-        <w:rPr>
-          <w:sz w:val="28"/>
-          <w:szCs w:val="28"/>
-        </w:rPr>
-      </w:pPr>
-      <w:r>
-        <w:rPr>
-          <w:b/>
-          <w:bCs/>
-          <w:sz w:val="32"/>
-          <w:szCs w:val="32"/>
-        </w:rPr>
-        <w:lastRenderedPageBreak/>
-        <w:t>Problem:</w:t>
-      </w:r>
-      <w:r>
-        <w:rPr>
-          <w:sz w:val="28"/>
-          <w:szCs w:val="28"/>
-        </w:rPr>
         <w:t xml:space="preserve"> Increasing -d (--delay-between-frames) to 100 makes the program/client very laggy.</w:t>
       </w:r>
     </w:p>
@@ -1293,8 +758,21 @@
           <w:sz w:val="28"/>
           <w:szCs w:val="28"/>
         </w:rPr>
-        <w:t>uint32_t frameIndex</w:t>
-      </w:r>
+        <w:t xml:space="preserve">uint32_t </w:t>
+      </w:r>
+      <w:proofErr w:type="spellStart"/>
+      <w:r>
+        <w:rPr>
+          <w:b/>
+          <w:bCs/>
+          <w:i/>
+          <w:iCs/>
+          <w:sz w:val="28"/>
+          <w:szCs w:val="28"/>
+        </w:rPr>
+        <w:t>frameIndex</w:t>
+      </w:r>
+      <w:proofErr w:type="spellEnd"/>
       <w:r>
         <w:rPr>
           <w:sz w:val="28"/>
@@ -1390,23 +868,14 @@
           <w:sz w:val="28"/>
           <w:szCs w:val="28"/>
         </w:rPr>
-        <w:t xml:space="preserve">This has the same issues as </w:t>
-      </w:r>
-      <w:r>
-        <w:rPr>
-          <w:b/>
-          <w:bCs/>
-          <w:sz w:val="28"/>
-          <w:szCs w:val="28"/>
-        </w:rPr>
-        <w:t xml:space="preserve">Part-1 Problem 4 </w:t>
-      </w:r>
-      <w:r>
-        <w:rPr>
-          <w:sz w:val="28"/>
-          <w:szCs w:val="28"/>
-        </w:rPr>
-        <w:t xml:space="preserve">where the size of Frame Metadata as per Assignment pdf which is </w:t>
+        <w:t>Size</w:t>
+      </w:r>
+      <w:r>
+        <w:rPr>
+          <w:sz w:val="28"/>
+          <w:szCs w:val="28"/>
+        </w:rPr>
+        <w:t xml:space="preserve"> of Frame Metadata as per Assignment pdf which is </w:t>
       </w:r>
       <w:r>
         <w:rPr>
@@ -1460,7 +929,15 @@
           <w:sz w:val="28"/>
           <w:szCs w:val="28"/>
         </w:rPr>
-        <w:t xml:space="preserve"> fixed the issue and also matches the server size (I don’t know why it didn’t have any issues while doing the previous Assignment).</w:t>
+        <w:t xml:space="preserve"> fixed the issue and also matches </w:t>
+      </w:r>
+      <w:r>
+        <w:rPr>
+          <w:sz w:val="28"/>
+          <w:szCs w:val="28"/>
+        </w:rPr>
+        <w:lastRenderedPageBreak/>
+        <w:t>the server size (I don’t know why it didn’t have any issues while doing the previous Assignment).</w:t>
       </w:r>
     </w:p>
     <w:p>
@@ -1509,7 +986,32 @@
           <w:sz w:val="28"/>
           <w:szCs w:val="28"/>
         </w:rPr>
-        <w:t>stuck waiting for client sendto() after requesting a certain frame when using flag -c (--continuous-packet-drop).</w:t>
+        <w:t xml:space="preserve">stuck waiting for client </w:t>
+      </w:r>
+      <w:proofErr w:type="spellStart"/>
+      <w:proofErr w:type="gramStart"/>
+      <w:r>
+        <w:rPr>
+          <w:sz w:val="28"/>
+          <w:szCs w:val="28"/>
+        </w:rPr>
+        <w:t>sendto</w:t>
+      </w:r>
+      <w:proofErr w:type="spellEnd"/>
+      <w:r>
+        <w:rPr>
+          <w:sz w:val="28"/>
+          <w:szCs w:val="28"/>
+        </w:rPr>
+        <w:t>(</w:t>
+      </w:r>
+      <w:proofErr w:type="gramEnd"/>
+      <w:r>
+        <w:rPr>
+          <w:sz w:val="28"/>
+          <w:szCs w:val="28"/>
+        </w:rPr>
+        <w:t>) after requesting a certain frame when using flag -c (--continuous-packet-drop).</w:t>
       </w:r>
     </w:p>
     <w:p>
@@ -1565,13 +1067,21 @@
         </w:rPr>
         <w:t xml:space="preserve">I am assuming that whenever Client sends request for a certain wrong </w:t>
       </w:r>
-      <w:r>
-        <w:rPr>
-          <w:sz w:val="28"/>
-          <w:szCs w:val="28"/>
-        </w:rPr>
-        <w:lastRenderedPageBreak/>
-        <w:t xml:space="preserve">frameIndex if server receives the request while it is in the middle of sending some other frame then that request is ignored. </w:t>
+      <w:proofErr w:type="spellStart"/>
+      <w:r>
+        <w:rPr>
+          <w:sz w:val="28"/>
+          <w:szCs w:val="28"/>
+        </w:rPr>
+        <w:t>frameIndex</w:t>
+      </w:r>
+      <w:proofErr w:type="spellEnd"/>
+      <w:r>
+        <w:rPr>
+          <w:sz w:val="28"/>
+          <w:szCs w:val="28"/>
+        </w:rPr>
+        <w:t xml:space="preserve"> if server receives the request while it is in the middle of sending some other frame then that request is ignored. </w:t>
       </w:r>
       <w:r>
         <w:rPr>
@@ -1579,7 +1089,64 @@
           <w:szCs w:val="28"/>
         </w:rPr>
         <w:br/>
-        <w:t>This was later fixed by adding a timeout to requestfrom() of 100ms. So whenever any response to “REQ i” doesn’t come from server within 100ms. The client sends the request again. If repeated requests are sent by Client</w:t>
+        <w:t xml:space="preserve">This was later fixed by adding a timeout to </w:t>
+      </w:r>
+      <w:proofErr w:type="spellStart"/>
+      <w:proofErr w:type="gramStart"/>
+      <w:r>
+        <w:rPr>
+          <w:sz w:val="28"/>
+          <w:szCs w:val="28"/>
+        </w:rPr>
+        <w:t>requestfrom</w:t>
+      </w:r>
+      <w:proofErr w:type="spellEnd"/>
+      <w:r>
+        <w:rPr>
+          <w:sz w:val="28"/>
+          <w:szCs w:val="28"/>
+        </w:rPr>
+        <w:t>(</w:t>
+      </w:r>
+      <w:proofErr w:type="gramEnd"/>
+      <w:r>
+        <w:rPr>
+          <w:sz w:val="28"/>
+          <w:szCs w:val="28"/>
+        </w:rPr>
+        <w:t xml:space="preserve">) of 100ms. </w:t>
+      </w:r>
+      <w:proofErr w:type="gramStart"/>
+      <w:r>
+        <w:rPr>
+          <w:sz w:val="28"/>
+          <w:szCs w:val="28"/>
+        </w:rPr>
+        <w:t>So</w:t>
+      </w:r>
+      <w:proofErr w:type="gramEnd"/>
+      <w:r>
+        <w:rPr>
+          <w:sz w:val="28"/>
+          <w:szCs w:val="28"/>
+        </w:rPr>
+        <w:t xml:space="preserve"> whenever any response to “REQ </w:t>
+      </w:r>
+      <w:proofErr w:type="spellStart"/>
+      <w:r>
+        <w:rPr>
+          <w:sz w:val="28"/>
+          <w:szCs w:val="28"/>
+        </w:rPr>
+        <w:t>i</w:t>
+      </w:r>
+      <w:proofErr w:type="spellEnd"/>
+      <w:r>
+        <w:rPr>
+          <w:sz w:val="28"/>
+          <w:szCs w:val="28"/>
+        </w:rPr>
+        <w:t>” doesn’t come from server within 100ms. The client sends the request again. If repeated requests are sent by Client</w:t>
       </w:r>
       <w:r>
         <w:rPr>
@@ -1723,51 +1290,40 @@
       </w:r>
       <w:r>
         <w:rPr>
-          <w:i/>
-          <w:iCs/>
-          <w:sz w:val="28"/>
-          <w:szCs w:val="28"/>
-        </w:rPr>
-        <w:t>This is just a hypothesis since I don’t have server code.</w:t>
-      </w:r>
-      <w:r>
-        <w:rPr>
-          <w:i/>
-          <w:iCs/>
-          <w:sz w:val="28"/>
-          <w:szCs w:val="28"/>
-        </w:rPr>
-        <w:br/>
-      </w:r>
-      <w:r>
-        <w:rPr>
-          <w:sz w:val="28"/>
-          <w:szCs w:val="28"/>
-        </w:rPr>
-        <w:t xml:space="preserve">I am assuming </w:t>
-      </w:r>
-      <w:r>
-        <w:rPr>
-          <w:sz w:val="28"/>
-          <w:szCs w:val="28"/>
-        </w:rPr>
-        <w:t xml:space="preserve">that even though in Assignment it is given that frameIndex to be of type uint32_t, in the server implementation for receiving requests it is using uint8_t, because after frame255 it takes 2B space instead of 1B for the payload and server resets wraps it around to 0 again. Without knowing further information on how server is receiving and decoding client requests and also proper validity and correctness of server code it is </w:t>
-      </w:r>
-      <w:r>
-        <w:rPr>
-          <w:b/>
-          <w:i/>
-          <w:sz w:val="28"/>
-          <w:szCs w:val="28"/>
-        </w:rPr>
-        <w:t>(in my opinion)</w:t>
-      </w:r>
-      <w:r>
-        <w:rPr>
-          <w:sz w:val="28"/>
-          <w:szCs w:val="28"/>
-        </w:rPr>
-        <w:t xml:space="preserve"> not possible to further explore this issue.</w:t>
+          <w:sz w:val="28"/>
+          <w:szCs w:val="28"/>
+        </w:rPr>
+        <w:t>Most likely it is due to the fact that my encoding method is different from how it is encoded and decoded in the server side</w:t>
+      </w:r>
+      <w:r>
+        <w:rPr>
+          <w:sz w:val="28"/>
+          <w:szCs w:val="28"/>
+        </w:rPr>
+        <w:t>.</w:t>
+      </w:r>
+      <w:r>
+        <w:rPr>
+          <w:sz w:val="28"/>
+          <w:szCs w:val="28"/>
+        </w:rPr>
+        <w:t xml:space="preserve"> That’s why at 256 frame number i.e. Starting at 2Byte </w:t>
+      </w:r>
+      <w:proofErr w:type="spellStart"/>
+      <w:r>
+        <w:rPr>
+          <w:sz w:val="28"/>
+          <w:szCs w:val="28"/>
+        </w:rPr>
+        <w:t>frame_id</w:t>
+      </w:r>
+      <w:proofErr w:type="spellEnd"/>
+      <w:r>
+        <w:rPr>
+          <w:sz w:val="28"/>
+          <w:szCs w:val="28"/>
+        </w:rPr>
+        <w:t xml:space="preserve"> it doesn’t work. However, without knowing how server encoded and decodes the messages further improvement can’t be done.</w:t>
       </w:r>
     </w:p>
     <w:p>
@@ -1806,7 +1362,21 @@
           <w:sz w:val="28"/>
           <w:szCs w:val="28"/>
         </w:rPr>
-        <w:t xml:space="preserve">Even with the above fix, if using flag -c then around frame 250, the video becomes very laggy to practically paused. </w:t>
+        <w:t>Even with the above fix</w:t>
+      </w:r>
+      <w:r>
+        <w:rPr>
+          <w:sz w:val="28"/>
+          <w:szCs w:val="28"/>
+        </w:rPr>
+        <w:t xml:space="preserve"> (3)</w:t>
+      </w:r>
+      <w:r>
+        <w:rPr>
+          <w:sz w:val="28"/>
+          <w:szCs w:val="28"/>
+        </w:rPr>
+        <w:t xml:space="preserve">, if using flag -c then around frame 250, the video becomes very laggy to practically paused. </w:t>
       </w:r>
       <w:r>
         <w:rPr>
@@ -1874,7 +1444,31 @@
           <w:sz w:val="28"/>
           <w:szCs w:val="28"/>
         </w:rPr>
-        <w:t>s very large, and client already previously sent many requests to server for a particular frame. If the server processes all frame requests one by one and keeps sending the same large frame multiple times, it takes a lot of time. And after all that processing the frame sent by server becomes useless. In the meantime while waiting the required frame client sends multiple requests for that frame and when it finally gets the desired frame, multiple previous requests to server for that frame is still pending. This results in a positive feedback loop and latency keeps increasing from then onwards.</w:t>
+        <w:t xml:space="preserve">s very large, and client already previously sent many requests to server for a particular frame. If the server processes all frame requests one by one and keeps sending the same large frame multiple times, it takes a lot of time. And after all that processing the frame sent by server becomes useless. In the </w:t>
+      </w:r>
+      <w:proofErr w:type="gramStart"/>
+      <w:r>
+        <w:rPr>
+          <w:sz w:val="28"/>
+          <w:szCs w:val="28"/>
+        </w:rPr>
+        <w:t>meantime</w:t>
+      </w:r>
+      <w:proofErr w:type="gramEnd"/>
+      <w:r>
+        <w:rPr>
+          <w:sz w:val="28"/>
+          <w:szCs w:val="28"/>
+        </w:rPr>
+        <w:t xml:space="preserve"> while waiting the required frame client sends multiple </w:t>
+      </w:r>
+      <w:r>
+        <w:rPr>
+          <w:sz w:val="28"/>
+          <w:szCs w:val="28"/>
+        </w:rPr>
+        <w:lastRenderedPageBreak/>
+        <w:t>requests for that frame and when it finally gets the desired frame, multiple previous requests to server for that frame is still pending. This results in a positive feedback loop and latency keeps increasing from then onwards.</w:t>
       </w:r>
       <w:r>
         <w:rPr>
@@ -1882,14 +1476,23 @@
           <w:szCs w:val="28"/>
         </w:rPr>
         <w:br/>
-      </w:r>
-      <w:r>
-        <w:rPr>
-          <w:sz w:val="28"/>
-          <w:szCs w:val="28"/>
-        </w:rPr>
-        <w:lastRenderedPageBreak/>
-        <w:t>One solution to this would be from the server side. Instead of processing all pending requests, only send frame from the last request. Also, whenever a frame request comes while another frame is in mid-transmission stop that transmission and start sending the newly requested frame. However, these are server side modifications and I can’t resolve it without the source code. This should in theory remove most if not all of buffer observed.</w:t>
+        <w:t xml:space="preserve">One solution to this would be from the server side. Instead of processing all pending requests, only send frame from the last request. Also, whenever a frame request comes while another frame is in mid-transmission stop that transmission and start sending the newly requested frame. However, these are </w:t>
+      </w:r>
+      <w:proofErr w:type="gramStart"/>
+      <w:r>
+        <w:rPr>
+          <w:sz w:val="28"/>
+          <w:szCs w:val="28"/>
+        </w:rPr>
+        <w:t>server side</w:t>
+      </w:r>
+      <w:proofErr w:type="gramEnd"/>
+      <w:r>
+        <w:rPr>
+          <w:sz w:val="28"/>
+          <w:szCs w:val="28"/>
+        </w:rPr>
+        <w:t xml:space="preserve"> modifications and I can’t resolve it without the source code. This should in theory remove most if not all of buffer observed.</w:t>
       </w:r>
     </w:p>
     <w:p>
@@ -1938,7 +1541,21 @@
           <w:sz w:val="28"/>
           <w:szCs w:val="28"/>
         </w:rPr>
-        <w:t xml:space="preserve">Setting --packet-drop-prob 0.9 or some other high value also introduces a very high buffer. </w:t>
+        <w:t xml:space="preserve">Setting --packet-drop-prob 0.9 or some other high value also introduces a very high </w:t>
+      </w:r>
+      <w:r>
+        <w:rPr>
+          <w:sz w:val="28"/>
+          <w:szCs w:val="28"/>
+        </w:rPr>
+        <w:t>lag</w:t>
+      </w:r>
+      <w:r>
+        <w:rPr>
+          <w:sz w:val="28"/>
+          <w:szCs w:val="28"/>
+        </w:rPr>
+        <w:t xml:space="preserve">. </w:t>
       </w:r>
       <w:r>
         <w:rPr>
@@ -2051,6 +1668,64 @@
       <w:pPr>
         <w:pStyle w:val="ListParagraph"/>
         <w:ind w:left="643"/>
+        <w:rPr>
+          <w:sz w:val="28"/>
+          <w:szCs w:val="28"/>
+        </w:rPr>
+      </w:pPr>
+    </w:p>
+    <w:p>
+      <w:pPr>
+        <w:pStyle w:val="ListParagraph"/>
+        <w:ind w:left="643"/>
+        <w:rPr>
+          <w:sz w:val="28"/>
+          <w:szCs w:val="28"/>
+        </w:rPr>
+      </w:pPr>
+    </w:p>
+    <w:p>
+      <w:pPr>
+        <w:pStyle w:val="ListParagraph"/>
+        <w:ind w:left="643"/>
+        <w:rPr>
+          <w:sz w:val="28"/>
+          <w:szCs w:val="28"/>
+        </w:rPr>
+      </w:pPr>
+    </w:p>
+    <w:p>
+      <w:pPr>
+        <w:pStyle w:val="ListParagraph"/>
+        <w:ind w:left="643"/>
+        <w:rPr>
+          <w:sz w:val="28"/>
+          <w:szCs w:val="28"/>
+        </w:rPr>
+      </w:pPr>
+    </w:p>
+    <w:p>
+      <w:pPr>
+        <w:pStyle w:val="ListParagraph"/>
+        <w:ind w:left="643"/>
+        <w:rPr>
+          <w:sz w:val="28"/>
+          <w:szCs w:val="28"/>
+        </w:rPr>
+      </w:pPr>
+    </w:p>
+    <w:p>
+      <w:pPr>
+        <w:pStyle w:val="ListParagraph"/>
+        <w:ind w:left="643"/>
+        <w:rPr>
+          <w:sz w:val="28"/>
+          <w:szCs w:val="28"/>
+        </w:rPr>
+      </w:pPr>
+    </w:p>
+    <w:p>
+      <w:pPr>
         <w:rPr>
           <w:sz w:val="28"/>
           <w:szCs w:val="28"/>
@@ -2082,6 +1757,7 @@
           <w:szCs w:val="48"/>
           <w:u w:val="single"/>
         </w:rPr>
+        <w:lastRenderedPageBreak/>
         <w:t xml:space="preserve">Part </w:t>
       </w:r>
       <w:r>
@@ -2104,6 +1780,127 @@
         </w:rPr>
         <w:t xml:space="preserve"> –</w:t>
       </w:r>
+    </w:p>
+    <w:p>
+      <w:pPr>
+        <w:rPr>
+          <w:rFonts w:ascii="Calibri Light" w:hAnsi="Calibri Light" w:cs="Calibri Light"/>
+          <w:sz w:val="28"/>
+          <w:szCs w:val="28"/>
+        </w:rPr>
+      </w:pPr>
+      <w:r>
+        <w:rPr>
+          <w:rFonts w:ascii="Calibri Light" w:hAnsi="Calibri Light" w:cs="Calibri Light"/>
+          <w:sz w:val="28"/>
+          <w:szCs w:val="28"/>
+        </w:rPr>
+        <w:t>There was no such problem faced while building server for Part 3, because most of it is covered in Part 1 and Part 2. Also</w:t>
+      </w:r>
+      <w:r>
+        <w:rPr>
+          <w:rFonts w:ascii="Calibri Light" w:hAnsi="Calibri Light" w:cs="Calibri Light"/>
+          <w:sz w:val="28"/>
+          <w:szCs w:val="28"/>
+        </w:rPr>
+        <w:t>, I had previously built 2 multiplayer online games based on Socket Programming in C++ (using TCP instead</w:t>
+      </w:r>
+      <w:r>
+        <w:rPr>
+          <w:rFonts w:ascii="Calibri Light" w:hAnsi="Calibri Light" w:cs="Calibri Light"/>
+          <w:sz w:val="28"/>
+          <w:szCs w:val="28"/>
+        </w:rPr>
+        <w:t xml:space="preserve"> of UDP</w:t>
+      </w:r>
+      <w:r>
+        <w:rPr>
+          <w:rFonts w:ascii="Calibri Light" w:hAnsi="Calibri Light" w:cs="Calibri Light"/>
+          <w:sz w:val="28"/>
+          <w:szCs w:val="28"/>
+        </w:rPr>
+        <w:t xml:space="preserve">) </w:t>
+      </w:r>
+    </w:p>
+    <w:p>
+      <w:pPr>
+        <w:rPr>
+          <w:rFonts w:ascii="Calibri Light" w:hAnsi="Calibri Light" w:cs="Calibri Light"/>
+          <w:sz w:val="28"/>
+          <w:szCs w:val="28"/>
+        </w:rPr>
+      </w:pPr>
+      <w:r>
+        <w:rPr>
+          <w:rFonts w:ascii="Calibri Light" w:hAnsi="Calibri Light" w:cs="Calibri Light"/>
+          <w:sz w:val="28"/>
+          <w:szCs w:val="28"/>
+        </w:rPr>
+        <w:t>[</w:t>
+      </w:r>
+      <w:hyperlink r:id="rId7" w:history="1">
+        <w:r>
+          <w:rPr>
+            <w:rStyle w:val="Hyperlink"/>
+            <w:rFonts w:ascii="Calibri Light" w:hAnsi="Calibri Light" w:cs="Calibri Light"/>
+            <w:sz w:val="28"/>
+            <w:szCs w:val="28"/>
+          </w:rPr>
+          <w:t>SAHAS-Arcade</w:t>
+        </w:r>
+      </w:hyperlink>
+      <w:r>
+        <w:rPr>
+          <w:rFonts w:ascii="Calibri Light" w:hAnsi="Calibri Light" w:cs="Calibri Light"/>
+          <w:sz w:val="28"/>
+          <w:szCs w:val="28"/>
+        </w:rPr>
+        <w:t xml:space="preserve"> and </w:t>
+      </w:r>
+      <w:hyperlink r:id="rId8" w:history="1">
+        <w:r>
+          <w:rPr>
+            <w:rStyle w:val="Hyperlink"/>
+            <w:rFonts w:ascii="Calibri Light" w:hAnsi="Calibri Light" w:cs="Calibri Light"/>
+            <w:sz w:val="28"/>
+            <w:szCs w:val="28"/>
+          </w:rPr>
+          <w:t>Soccer-Stars</w:t>
+        </w:r>
+      </w:hyperlink>
+      <w:r>
+        <w:rPr>
+          <w:rFonts w:ascii="Calibri Light" w:hAnsi="Calibri Light" w:cs="Calibri Light"/>
+          <w:sz w:val="28"/>
+          <w:szCs w:val="28"/>
+        </w:rPr>
+        <w:t>]</w:t>
+      </w:r>
+      <w:r>
+        <w:rPr>
+          <w:rFonts w:ascii="Calibri Light" w:hAnsi="Calibri Light" w:cs="Calibri Light"/>
+          <w:sz w:val="28"/>
+          <w:szCs w:val="28"/>
+        </w:rPr>
+        <w:t>,</w:t>
+      </w:r>
+      <w:r>
+        <w:rPr>
+          <w:rFonts w:ascii="Calibri Light" w:hAnsi="Calibri Light" w:cs="Calibri Light"/>
+          <w:sz w:val="28"/>
+          <w:szCs w:val="28"/>
+        </w:rPr>
+        <w:t xml:space="preserve"> so there was no major problem as such.</w:t>
+      </w:r>
+    </w:p>
+    <w:p>
+      <w:pPr>
+        <w:rPr>
+          <w:rFonts w:ascii="Calibri Light" w:hAnsi="Calibri Light" w:cs="Calibri Light"/>
+          <w:sz w:val="28"/>
+          <w:szCs w:val="28"/>
+        </w:rPr>
+      </w:pPr>
     </w:p>
     <w:p>
       <w:pPr>
@@ -2128,12 +1925,67 @@
         </w:rPr>
         <w:t xml:space="preserve">Problem: </w:t>
       </w:r>
+      <w:proofErr w:type="spellStart"/>
+      <w:proofErr w:type="gramStart"/>
+      <w:r>
+        <w:rPr>
+          <w:bCs/>
+          <w:i/>
+          <w:iCs/>
+          <w:sz w:val="28"/>
+          <w:szCs w:val="28"/>
+        </w:rPr>
+        <w:t>sizeof</w:t>
+      </w:r>
+      <w:proofErr w:type="spellEnd"/>
+      <w:r>
+        <w:rPr>
+          <w:bCs/>
+          <w:i/>
+          <w:iCs/>
+          <w:sz w:val="28"/>
+          <w:szCs w:val="28"/>
+        </w:rPr>
+        <w:t>(</w:t>
+      </w:r>
+      <w:proofErr w:type="gramEnd"/>
+      <w:r>
+        <w:rPr>
+          <w:bCs/>
+          <w:i/>
+          <w:iCs/>
+          <w:sz w:val="28"/>
+          <w:szCs w:val="28"/>
+        </w:rPr>
+        <w:t>Struct)</w:t>
+      </w:r>
+      <w:r>
+        <w:rPr>
+          <w:bCs/>
+          <w:i/>
+          <w:iCs/>
+          <w:sz w:val="28"/>
+          <w:szCs w:val="28"/>
+        </w:rPr>
+        <w:t xml:space="preserve"> </w:t>
+      </w:r>
+      <w:r>
+        <w:rPr>
+          <w:bCs/>
+          <w:sz w:val="28"/>
+          <w:szCs w:val="28"/>
+        </w:rPr>
+        <w:t>giving incorrect size due to Byte Alignment.</w:t>
+      </w:r>
     </w:p>
     <w:p>
       <w:pPr>
         <w:pStyle w:val="ListParagraph"/>
         <w:ind w:left="643"/>
         <w:rPr>
+          <w:b/>
+          <w:bCs/>
+          <w:iCs/>
           <w:sz w:val="28"/>
           <w:szCs w:val="28"/>
         </w:rPr>
@@ -2150,12 +2002,298 @@
       <w:r>
         <w:t xml:space="preserve"> </w:t>
       </w:r>
+      <w:r>
+        <w:rPr>
+          <w:sz w:val="28"/>
+          <w:szCs w:val="28"/>
+        </w:rPr>
+        <w:t xml:space="preserve">Add </w:t>
+      </w:r>
+      <w:r>
+        <w:rPr>
+          <w:i/>
+          <w:sz w:val="28"/>
+          <w:szCs w:val="28"/>
+        </w:rPr>
+        <w:t>#pragma</w:t>
+      </w:r>
+      <w:r>
+        <w:rPr>
+          <w:i/>
+          <w:sz w:val="28"/>
+          <w:szCs w:val="28"/>
+        </w:rPr>
+        <w:t xml:space="preserve"> pack(push,1) </w:t>
+      </w:r>
+      <w:r>
+        <w:rPr>
+          <w:iCs/>
+          <w:sz w:val="28"/>
+          <w:szCs w:val="28"/>
+        </w:rPr>
+        <w:t xml:space="preserve">before struct declaration and </w:t>
+      </w:r>
+      <w:r>
+        <w:rPr>
+          <w:i/>
+          <w:sz w:val="28"/>
+          <w:szCs w:val="28"/>
+        </w:rPr>
+        <w:t xml:space="preserve">#pragma pack(pop) </w:t>
+      </w:r>
+      <w:r>
+        <w:rPr>
+          <w:iCs/>
+          <w:sz w:val="28"/>
+          <w:szCs w:val="28"/>
+        </w:rPr>
+        <w:t>after declared. This keeps 1Byte alignment and avoid memory address issues.</w:t>
+      </w:r>
     </w:p>
     <w:p/>
+    <w:p>
+      <w:pPr>
+        <w:pStyle w:val="ListParagraph"/>
+        <w:numPr>
+          <w:ilvl w:val="0"/>
+          <w:numId w:val="3"/>
+        </w:numPr>
+        <w:rPr>
+          <w:b/>
+          <w:bCs/>
+          <w:sz w:val="32"/>
+          <w:szCs w:val="32"/>
+        </w:rPr>
+      </w:pPr>
+      <w:r>
+        <w:rPr>
+          <w:b/>
+          <w:bCs/>
+          <w:sz w:val="32"/>
+          <w:szCs w:val="32"/>
+        </w:rPr>
+        <w:t>Problem:</w:t>
+      </w:r>
+      <w:r>
+        <w:rPr>
+          <w:bCs/>
+          <w:sz w:val="28"/>
+          <w:szCs w:val="28"/>
+        </w:rPr>
+        <w:t xml:space="preserve"> Unable to connect from </w:t>
+      </w:r>
+      <w:r>
+        <w:rPr>
+          <w:bCs/>
+          <w:i/>
+          <w:iCs/>
+          <w:sz w:val="28"/>
+          <w:szCs w:val="28"/>
+        </w:rPr>
+        <w:t>client.exe</w:t>
+      </w:r>
+      <w:r>
+        <w:rPr>
+          <w:bCs/>
+          <w:sz w:val="28"/>
+          <w:szCs w:val="28"/>
+        </w:rPr>
+        <w:t xml:space="preserve"> (Windows version) to my UDP server.</w:t>
+      </w:r>
+    </w:p>
+    <w:p>
+      <w:pPr>
+        <w:ind w:left="643"/>
+        <w:rPr>
+          <w:sz w:val="28"/>
+          <w:szCs w:val="28"/>
+        </w:rPr>
+      </w:pPr>
+      <w:r>
+        <w:rPr>
+          <w:b/>
+          <w:bCs/>
+          <w:sz w:val="32"/>
+          <w:szCs w:val="32"/>
+        </w:rPr>
+        <w:t>Solution:</w:t>
+      </w:r>
+      <w:r>
+        <w:t xml:space="preserve"> </w:t>
+      </w:r>
+      <w:r>
+        <w:rPr>
+          <w:sz w:val="28"/>
+          <w:szCs w:val="28"/>
+        </w:rPr>
+        <w:t xml:space="preserve">I am using Windows 11 and using WSL 2 (Ubuntu 22.04) to run my </w:t>
+      </w:r>
+      <w:r>
+        <w:rPr>
+          <w:i/>
+          <w:iCs/>
+          <w:sz w:val="28"/>
+          <w:szCs w:val="28"/>
+        </w:rPr>
+        <w:t>server3.cpp</w:t>
+      </w:r>
+      <w:r>
+        <w:rPr>
+          <w:i/>
+          <w:iCs/>
+          <w:sz w:val="28"/>
+          <w:szCs w:val="28"/>
+        </w:rPr>
+        <w:t xml:space="preserve"> </w:t>
+      </w:r>
+      <w:r>
+        <w:rPr>
+          <w:sz w:val="28"/>
+          <w:szCs w:val="28"/>
+        </w:rPr>
+        <w:t xml:space="preserve">code. Instead of using </w:t>
+      </w:r>
+      <w:r>
+        <w:rPr>
+          <w:i/>
+          <w:iCs/>
+          <w:sz w:val="28"/>
+          <w:szCs w:val="28"/>
+        </w:rPr>
+        <w:t>client.exe (Windows)</w:t>
+      </w:r>
+      <w:r>
+        <w:rPr>
+          <w:sz w:val="28"/>
+          <w:szCs w:val="28"/>
+        </w:rPr>
+        <w:t xml:space="preserve">, doing </w:t>
+      </w:r>
+      <w:proofErr w:type="gramStart"/>
+      <w:r>
+        <w:rPr>
+          <w:sz w:val="28"/>
+          <w:szCs w:val="28"/>
+        </w:rPr>
+        <w:t xml:space="preserve">- </w:t>
+      </w:r>
+      <w:r>
+        <w:rPr>
+          <w:i/>
+          <w:iCs/>
+          <w:sz w:val="28"/>
+          <w:szCs w:val="28"/>
+        </w:rPr>
+        <w:t>.</w:t>
+      </w:r>
+      <w:proofErr w:type="gramEnd"/>
+      <w:r>
+        <w:rPr>
+          <w:i/>
+          <w:iCs/>
+          <w:sz w:val="28"/>
+          <w:szCs w:val="28"/>
+        </w:rPr>
+        <w:t>/client (Linux Version)</w:t>
+      </w:r>
+      <w:r>
+        <w:rPr>
+          <w:sz w:val="28"/>
+          <w:szCs w:val="28"/>
+        </w:rPr>
+        <w:t xml:space="preserve"> is able to connect to my server.</w:t>
+      </w:r>
+    </w:p>
+    <w:p>
+      <w:pPr>
+        <w:ind w:left="643"/>
+      </w:pPr>
+    </w:p>
+    <w:p>
+      <w:pPr>
+        <w:pStyle w:val="ListParagraph"/>
+        <w:numPr>
+          <w:ilvl w:val="0"/>
+          <w:numId w:val="3"/>
+        </w:numPr>
+        <w:rPr>
+          <w:b/>
+          <w:bCs/>
+          <w:sz w:val="32"/>
+          <w:szCs w:val="32"/>
+        </w:rPr>
+      </w:pPr>
+      <w:r>
+        <w:rPr>
+          <w:b/>
+          <w:bCs/>
+          <w:sz w:val="32"/>
+          <w:szCs w:val="32"/>
+        </w:rPr>
+        <w:t>Irrele</w:t>
+      </w:r>
+      <w:r>
+        <w:rPr>
+          <w:b/>
+          <w:bCs/>
+          <w:sz w:val="32"/>
+          <w:szCs w:val="32"/>
+        </w:rPr>
+        <w:t xml:space="preserve">vant </w:t>
+      </w:r>
+      <w:r>
+        <w:rPr>
+          <w:b/>
+          <w:bCs/>
+          <w:sz w:val="32"/>
+          <w:szCs w:val="32"/>
+        </w:rPr>
+        <w:t>Problem:</w:t>
+      </w:r>
+      <w:r>
+        <w:rPr>
+          <w:bCs/>
+          <w:sz w:val="28"/>
+          <w:szCs w:val="28"/>
+        </w:rPr>
+        <w:t xml:space="preserve"> </w:t>
+      </w:r>
+      <w:r>
+        <w:rPr>
+          <w:bCs/>
+          <w:sz w:val="28"/>
+          <w:szCs w:val="28"/>
+        </w:rPr>
+        <w:t xml:space="preserve">Holding down spacebar does not keep the player jumping. </w:t>
+      </w:r>
+      <w:proofErr w:type="gramStart"/>
+      <w:r>
+        <w:rPr>
+          <w:bCs/>
+          <w:sz w:val="28"/>
+          <w:szCs w:val="28"/>
+        </w:rPr>
+        <w:t>Generally</w:t>
+      </w:r>
+      <w:proofErr w:type="gramEnd"/>
+      <w:r>
+        <w:rPr>
+          <w:bCs/>
+          <w:sz w:val="28"/>
+          <w:szCs w:val="28"/>
+        </w:rPr>
+        <w:t xml:space="preserve"> in video games, holding down spacebar or any other action key the player keeps doing it until released. However, in this case it only jumps once and then stops jumping.</w:t>
+      </w:r>
+    </w:p>
+    <w:p>
+      <w:pPr>
+        <w:ind w:left="643"/>
+      </w:pPr>
+    </w:p>
     <w:sectPr>
-      <w:headerReference w:type="default" r:id="rId7"/>
-      <w:footerReference w:type="default" r:id="rId8"/>
-      <w:footerReference w:type="first" r:id="rId9"/>
+      <w:headerReference w:type="default" r:id="rId9"/>
+      <w:footerReference w:type="default" r:id="rId10"/>
+      <w:footerReference w:type="first" r:id="rId11"/>
       <w:pgSz w:w="11906" w:h="16838"/>
       <w:pgMar w:top="1440" w:right="1440" w:bottom="1440" w:left="1440" w:header="708" w:footer="708" w:gutter="0"/>
       <w:cols w:space="708"/>
@@ -3167,7 +3305,7 @@
   <w:style w:type="paragraph" w:default="1" w:styleId="Normal">
     <w:name w:val="Normal"/>
     <w:qFormat/>
-    <w:rsid w:val="00502087"/>
+    <w:rsid w:val="00313C19"/>
   </w:style>
   <w:style w:type="paragraph" w:styleId="Heading1">
     <w:name w:val="heading 1"/>
@@ -3745,6 +3883,29 @@
     <w:uiPriority w:val="99"/>
     <w:rsid w:val="002458AF"/>
   </w:style>
+  <w:style w:type="character" w:styleId="Hyperlink">
+    <w:name w:val="Hyperlink"/>
+    <w:basedOn w:val="DefaultParagraphFont"/>
+    <w:uiPriority w:val="99"/>
+    <w:unhideWhenUsed/>
+    <w:rsid w:val="00AD6C2A"/>
+    <w:rPr>
+      <w:color w:val="0563C1" w:themeColor="hyperlink"/>
+      <w:u w:val="single"/>
+    </w:rPr>
+  </w:style>
+  <w:style w:type="character" w:styleId="UnresolvedMention">
+    <w:name w:val="Unresolved Mention"/>
+    <w:basedOn w:val="DefaultParagraphFont"/>
+    <w:uiPriority w:val="99"/>
+    <w:semiHidden/>
+    <w:unhideWhenUsed/>
+    <w:rsid w:val="00AD6C2A"/>
+    <w:rPr>
+      <w:color w:val="605E5C"/>
+      <w:shd w:val="clear" w:color="auto" w:fill="E1DFDD"/>
+    </w:rPr>
+  </w:style>
 </w:styles>
 </file>
 

</xml_diff>